<commit_message>
Ajout d'une feuille de calcul a la bdd appelée audit, et avancement jusqu'au début de l'exo 4
</commit_message>
<xml_diff>
--- a/Fiche jeu de donnée.docx
+++ b/Fiche jeu de donnée.docx
@@ -2,9 +2,25 @@
 <file path=word/document.xml><?xml version="1.0" encoding="utf-8"?>
 <w:document xmlns:wpc="http://schemas.microsoft.com/office/word/2010/wordprocessingCanvas" xmlns:cx="http://schemas.microsoft.com/office/drawing/2014/chartex" xmlns:cx1="http://schemas.microsoft.com/office/drawing/2015/9/8/chartex" xmlns:cx2="http://schemas.microsoft.com/office/drawing/2015/10/21/chartex" xmlns:cx3="http://schemas.microsoft.com/office/drawing/2016/5/9/chartex" xmlns:cx4="http://schemas.microsoft.com/office/drawing/2016/5/10/chartex" xmlns:cx5="http://schemas.microsoft.com/office/drawing/2016/5/11/chartex" xmlns:cx6="http://schemas.microsoft.com/office/drawing/2016/5/12/chartex" xmlns:cx7="http://schemas.microsoft.com/office/drawing/2016/5/13/chartex" xmlns:cx8="http://schemas.microsoft.com/office/drawing/2016/5/14/chartex" xmlns:mc="http://schemas.openxmlformats.org/markup-compatibility/2006" xmlns:aink="http://schemas.microsoft.com/office/drawing/2016/ink" xmlns:am3d="http://schemas.microsoft.com/office/drawing/2017/model3d" xmlns:o="urn:schemas-microsoft-com:office:office" xmlns:oel="http://schemas.microsoft.com/office/2019/extlst" xmlns:r="http://schemas.openxmlformats.org/officeDocument/2006/relationships" xmlns:m="http://schemas.openxmlformats.org/officeDocument/2006/math" xmlns:v="urn:schemas-microsoft-com:vml" xmlns:wp14="http://schemas.microsoft.com/office/word/2010/wordprocessingDrawing" xmlns:wp="http://schemas.openxmlformats.org/drawingml/2006/wordprocessingDrawing" xmlns:w10="urn:schemas-microsoft-com:office:word" xmlns:w="http://schemas.openxmlformats.org/wordprocessingml/2006/main" xmlns:w14="http://schemas.microsoft.com/office/word/2010/wordml" xmlns:w15="http://schemas.microsoft.com/office/word/2012/wordml" xmlns:w16cex="http://schemas.microsoft.com/office/word/2018/wordml/cex" xmlns:w16cid="http://schemas.microsoft.com/office/word/2016/wordml/cid" xmlns:w16="http://schemas.microsoft.com/office/word/2018/wordml" xmlns:w16sdtdh="http://schemas.microsoft.com/office/word/2020/wordml/sdtdatahash" xmlns:w16se="http://schemas.microsoft.com/office/word/2015/wordml/symex" xmlns:wpg="http://schemas.microsoft.com/office/word/2010/wordprocessingGroup" xmlns:wpi="http://schemas.microsoft.com/office/word/2010/wordprocessingInk" xmlns:wne="http://schemas.microsoft.com/office/word/2006/wordml" xmlns:wps="http://schemas.microsoft.com/office/word/2010/wordprocessingShape" mc:Ignorable="w14 w15 w16se w16cid w16 w16cex w16sdtdh wp14">
   <w:body>
+    <w:p>
+      <w:pPr>
+        <w:rPr>
+          <w:b/>
+          <w:bCs/>
+        </w:rPr>
+      </w:pPr>
+      <w:r>
+        <w:rPr>
+          <w:b/>
+          <w:bCs/>
+        </w:rPr>
+        <w:t>1. Lire la fiche du jeu (15 min)</w:t>
+      </w:r>
+    </w:p>
     <w:tbl>
       <w:tblPr>
         <w:tblStyle w:val="Grilledutableau"/>
+        <w:tblpPr w:leftFromText="141" w:rightFromText="141" w:vertAnchor="page" w:horzAnchor="margin" w:tblpY="2281"/>
         <w:tblW w:w="0" w:type="auto"/>
         <w:tblLook w:val="04A0" w:firstRow="1" w:lastRow="0" w:firstColumn="1" w:lastColumn="0" w:noHBand="0" w:noVBand="1"/>
       </w:tblPr>
@@ -136,7 +152,7 @@
             <w:tcW w:w="5806" w:type="dxa"/>
           </w:tcPr>
           <w:p>
-            <w:hyperlink r:id="rId4" w:history="1">
+            <w:hyperlink r:id="rId5" w:history="1">
               <w:r>
                 <w:rPr>
                   <w:rStyle w:val="Lienhypertexte"/>
@@ -254,7 +270,1182 @@
         </w:tc>
       </w:tr>
     </w:tbl>
+    <w:p>
+      <w:r>
+        <w:t>Complétez le tableau d'identité ci-dessous </w:t>
+      </w:r>
+      <w:r>
+        <w:rPr>
+          <w:b/>
+          <w:bCs/>
+        </w:rPr>
+        <w:t>avant</w:t>
+      </w:r>
+      <w:r>
+        <w:t> d'ouvrir le fichier.</w:t>
+      </w:r>
+    </w:p>
     <w:p/>
+    <w:p/>
+    <w:p>
+      <w:pPr>
+        <w:rPr>
+          <w:b/>
+          <w:bCs/>
+        </w:rPr>
+      </w:pPr>
+      <w:r>
+        <w:rPr>
+          <w:b/>
+          <w:bCs/>
+        </w:rPr>
+        <w:t>2. Ouvrir et décrire (15 min)</w:t>
+      </w:r>
+    </w:p>
+    <w:p/>
+    <w:p>
+      <w:pPr>
+        <w:pStyle w:val="Paragraphedeliste"/>
+        <w:numPr>
+          <w:ilvl w:val="0"/>
+          <w:numId w:val="1"/>
+        </w:numPr>
+      </w:pPr>
+      <w:r>
+        <w:t xml:space="preserve">Nombre de lignes : </w:t>
+      </w:r>
+      <w:r>
+        <w:t>7115</w:t>
+      </w:r>
+      <w:r>
+        <w:t xml:space="preserve">, nombre de colonne : </w:t>
+      </w:r>
+      <w:r>
+        <w:t>5</w:t>
+      </w:r>
+    </w:p>
+    <w:p>
+      <w:pPr>
+        <w:pStyle w:val="Paragraphedeliste"/>
+      </w:pPr>
+    </w:p>
+    <w:p>
+      <w:pPr>
+        <w:pStyle w:val="Paragraphedeliste"/>
+        <w:numPr>
+          <w:ilvl w:val="0"/>
+          <w:numId w:val="1"/>
+        </w:numPr>
+      </w:pPr>
+      <w:r>
+        <w:t>Pour 5 colonnes au choix : nom, type de valeur (texte, nombre, date), exemple de valeur.</w:t>
+      </w:r>
+    </w:p>
+    <w:p>
+      <w:pPr>
+        <w:pStyle w:val="Paragraphedeliste"/>
+        <w:numPr>
+          <w:ilvl w:val="1"/>
+          <w:numId w:val="1"/>
+        </w:numPr>
+      </w:pPr>
+      <w:r>
+        <w:t xml:space="preserve">Colonne C : Longitude : nombre a virgule. ex </w:t>
+      </w:r>
+      <w:r>
+        <w:t>314069.121289</w:t>
+      </w:r>
+    </w:p>
+    <w:p>
+      <w:pPr>
+        <w:pStyle w:val="Paragraphedeliste"/>
+        <w:numPr>
+          <w:ilvl w:val="1"/>
+          <w:numId w:val="1"/>
+        </w:numPr>
+      </w:pPr>
+      <w:r>
+        <w:t>Colonne F : Adresse : Chaine de caractère. Ex :</w:t>
+      </w:r>
+      <w:r>
+        <w:t xml:space="preserve"> </w:t>
+      </w:r>
+      <w:r>
+        <w:t>53 Rue Joseph Mattei</w:t>
+      </w:r>
+    </w:p>
+    <w:p>
+      <w:pPr>
+        <w:pStyle w:val="Paragraphedeliste"/>
+        <w:numPr>
+          <w:ilvl w:val="1"/>
+          <w:numId w:val="1"/>
+        </w:numPr>
+      </w:pPr>
+      <w:r>
+        <w:t xml:space="preserve">Colonne R : </w:t>
+      </w:r>
+      <w:r>
+        <w:t>Prix E85</w:t>
+      </w:r>
+      <w:r>
+        <w:t> : nombre a virgule. Ex : 0.83</w:t>
+      </w:r>
+    </w:p>
+    <w:p>
+      <w:pPr>
+        <w:pStyle w:val="Paragraphedeliste"/>
+        <w:numPr>
+          <w:ilvl w:val="1"/>
+          <w:numId w:val="1"/>
+        </w:numPr>
+      </w:pPr>
+      <w:r>
+        <w:t xml:space="preserve">Colonne AN : </w:t>
+      </w:r>
+      <w:r>
+        <w:t xml:space="preserve">Carburants en rupture </w:t>
+      </w:r>
+      <w:r>
+        <w:t>définitive</w:t>
+      </w:r>
+      <w:r>
+        <w:t xml:space="preserve"> : Chaine de caractère. Ex : </w:t>
+      </w:r>
+      <w:r>
+        <w:t>SP95;E85;GPLc</w:t>
+      </w:r>
+    </w:p>
+    <w:p>
+      <w:pPr>
+        <w:pStyle w:val="Paragraphedeliste"/>
+        <w:numPr>
+          <w:ilvl w:val="1"/>
+          <w:numId w:val="1"/>
+        </w:numPr>
+      </w:pPr>
+      <w:r>
+        <w:t xml:space="preserve">Colonne AP : services proposés : chaine de caractères. Ex : </w:t>
+      </w:r>
+      <w:r>
+        <w:t xml:space="preserve">Toilettes </w:t>
+      </w:r>
+      <w:proofErr w:type="spellStart"/>
+      <w:r>
+        <w:t>publiques,Laverie,Relais</w:t>
+      </w:r>
+      <w:proofErr w:type="spellEnd"/>
+      <w:r>
+        <w:t xml:space="preserve"> </w:t>
+      </w:r>
+      <w:proofErr w:type="spellStart"/>
+      <w:r>
+        <w:t>colis,Boutique</w:t>
+      </w:r>
+      <w:proofErr w:type="spellEnd"/>
+      <w:r>
+        <w:t xml:space="preserve"> non </w:t>
+      </w:r>
+      <w:proofErr w:type="spellStart"/>
+      <w:r>
+        <w:t>alimentaire,Restauration</w:t>
+      </w:r>
+      <w:proofErr w:type="spellEnd"/>
+      <w:r>
+        <w:t xml:space="preserve"> à </w:t>
+      </w:r>
+      <w:proofErr w:type="spellStart"/>
+      <w:r>
+        <w:t>emporter,Restauration</w:t>
+      </w:r>
+      <w:proofErr w:type="spellEnd"/>
+      <w:r>
+        <w:t xml:space="preserve"> sur </w:t>
+      </w:r>
+      <w:proofErr w:type="spellStart"/>
+      <w:r>
+        <w:t>place,Bar,Vente</w:t>
+      </w:r>
+      <w:proofErr w:type="spellEnd"/>
+      <w:r>
+        <w:t xml:space="preserve"> de pétrole </w:t>
+      </w:r>
+      <w:proofErr w:type="spellStart"/>
+      <w:r>
+        <w:t>lampant,Station</w:t>
+      </w:r>
+      <w:proofErr w:type="spellEnd"/>
+      <w:r>
+        <w:t xml:space="preserve"> de </w:t>
+      </w:r>
+      <w:proofErr w:type="spellStart"/>
+      <w:r>
+        <w:t>gonflage,Location</w:t>
+      </w:r>
+      <w:proofErr w:type="spellEnd"/>
+      <w:r>
+        <w:t xml:space="preserve"> de </w:t>
+      </w:r>
+      <w:proofErr w:type="spellStart"/>
+      <w:r>
+        <w:t>véhicule,Piste</w:t>
+      </w:r>
+      <w:proofErr w:type="spellEnd"/>
+      <w:r>
+        <w:t xml:space="preserve"> poids </w:t>
+      </w:r>
+      <w:proofErr w:type="spellStart"/>
+      <w:r>
+        <w:t>lourds,Espace</w:t>
+      </w:r>
+      <w:proofErr w:type="spellEnd"/>
+      <w:r>
+        <w:t xml:space="preserve"> </w:t>
+      </w:r>
+      <w:proofErr w:type="spellStart"/>
+      <w:r>
+        <w:t>bébé,Vente</w:t>
+      </w:r>
+      <w:proofErr w:type="spellEnd"/>
+      <w:r>
+        <w:t xml:space="preserve"> de gaz domestique (Butane, Propane),</w:t>
+      </w:r>
+      <w:proofErr w:type="spellStart"/>
+      <w:r>
+        <w:t>Wifi,Automate</w:t>
+      </w:r>
+      <w:proofErr w:type="spellEnd"/>
+      <w:r>
+        <w:t xml:space="preserve"> CB 24/24,DAB (Distributeur automatique de billets)</w:t>
+      </w:r>
+    </w:p>
+    <w:p>
+      <w:pPr>
+        <w:pStyle w:val="Paragraphedeliste"/>
+        <w:ind w:left="1440"/>
+      </w:pPr>
+    </w:p>
+    <w:p>
+      <w:pPr>
+        <w:pStyle w:val="Paragraphedeliste"/>
+        <w:numPr>
+          <w:ilvl w:val="0"/>
+          <w:numId w:val="1"/>
+        </w:numPr>
+      </w:pPr>
+      <w:r>
+        <w:t>Signalez tout problème d'ouverture (séparateur, accents mal affichés, dates en texte).</w:t>
+      </w:r>
+    </w:p>
+    <w:p>
+      <w:pPr>
+        <w:pStyle w:val="Paragraphedeliste"/>
+      </w:pPr>
+      <w:r>
+        <w:t>Aucuns problèmes particuliers</w:t>
+      </w:r>
+    </w:p>
+    <w:p>
+      <w:pPr>
+        <w:pStyle w:val="Paragraphedeliste"/>
+      </w:pPr>
+    </w:p>
+    <w:p>
+      <w:pPr>
+        <w:pStyle w:val="Paragraphedeliste"/>
+        <w:rPr>
+          <w:b/>
+          <w:bCs/>
+        </w:rPr>
+      </w:pPr>
+    </w:p>
+    <w:p>
+      <w:pPr>
+        <w:pStyle w:val="Paragraphedeliste"/>
+        <w:rPr>
+          <w:b/>
+          <w:bCs/>
+        </w:rPr>
+      </w:pPr>
+      <w:r>
+        <w:rPr>
+          <w:b/>
+          <w:bCs/>
+        </w:rPr>
+        <w:lastRenderedPageBreak/>
+        <w:t>3. Remplir la grille qualité (35 min)</w:t>
+      </w:r>
+    </w:p>
+    <w:p>
+      <w:pPr>
+        <w:pStyle w:val="Paragraphedeliste"/>
+      </w:pPr>
+      <w:r>
+        <w:t>Pour chaque dimension, donnez </w:t>
+      </w:r>
+      <w:r>
+        <w:rPr>
+          <w:b/>
+          <w:bCs/>
+        </w:rPr>
+        <w:t>au moins un constat chiffré ou un exemple précis</w:t>
+      </w:r>
+      <w:r>
+        <w:t> (ligne, colonne, valeur).</w:t>
+      </w:r>
+    </w:p>
+    <w:p>
+      <w:pPr>
+        <w:pStyle w:val="Paragraphedeliste"/>
+      </w:pPr>
+    </w:p>
+    <w:tbl>
+      <w:tblPr>
+        <w:tblStyle w:val="Grilledutableau"/>
+        <w:tblW w:w="0" w:type="auto"/>
+        <w:tblInd w:w="426" w:type="dxa"/>
+        <w:tblLook w:val="04A0" w:firstRow="1" w:lastRow="0" w:firstColumn="1" w:lastColumn="0" w:noHBand="0" w:noVBand="1"/>
+      </w:tblPr>
+      <w:tblGrid>
+        <w:gridCol w:w="2091"/>
+        <w:gridCol w:w="2901"/>
+        <w:gridCol w:w="1904"/>
+        <w:gridCol w:w="1740"/>
+      </w:tblGrid>
+      <w:tr>
+        <w:tc>
+          <w:tcPr>
+            <w:tcW w:w="2121" w:type="dxa"/>
+          </w:tcPr>
+          <w:p>
+            <w:pPr>
+              <w:rPr>
+                <w:b/>
+                <w:bCs/>
+              </w:rPr>
+            </w:pPr>
+            <w:r>
+              <w:rPr>
+                <w:b/>
+                <w:bCs/>
+              </w:rPr>
+              <w:t>Dimension</w:t>
+            </w:r>
+          </w:p>
+          <w:p>
+            <w:pPr>
+              <w:pStyle w:val="Paragraphedeliste"/>
+              <w:ind w:left="0"/>
+              <w:rPr>
+                <w:b/>
+                <w:bCs/>
+              </w:rPr>
+            </w:pPr>
+          </w:p>
+        </w:tc>
+        <w:tc>
+          <w:tcPr>
+            <w:tcW w:w="2977" w:type="dxa"/>
+          </w:tcPr>
+          <w:p>
+            <w:pPr>
+              <w:rPr>
+                <w:b/>
+                <w:bCs/>
+              </w:rPr>
+            </w:pPr>
+            <w:r>
+              <w:rPr>
+                <w:b/>
+                <w:bCs/>
+              </w:rPr>
+              <w:t>Méthode utilisée dans le tableur</w:t>
+            </w:r>
+          </w:p>
+          <w:p>
+            <w:pPr>
+              <w:pStyle w:val="Paragraphedeliste"/>
+              <w:ind w:left="0"/>
+              <w:rPr>
+                <w:b/>
+                <w:bCs/>
+              </w:rPr>
+            </w:pPr>
+          </w:p>
+        </w:tc>
+        <w:tc>
+          <w:tcPr>
+            <w:tcW w:w="1767" w:type="dxa"/>
+          </w:tcPr>
+          <w:p>
+            <w:pPr>
+              <w:pStyle w:val="Paragraphedeliste"/>
+              <w:ind w:left="0"/>
+              <w:rPr>
+                <w:b/>
+                <w:bCs/>
+              </w:rPr>
+            </w:pPr>
+            <w:r>
+              <w:rPr>
+                <w:b/>
+                <w:bCs/>
+              </w:rPr>
+              <w:t>Constat (chiffré ou exemple)</w:t>
+            </w:r>
+            <w:r>
+              <w:rPr>
+                <w:b/>
+                <w:bCs/>
+              </w:rPr>
+              <w:tab/>
+            </w:r>
+          </w:p>
+        </w:tc>
+        <w:tc>
+          <w:tcPr>
+            <w:tcW w:w="1771" w:type="dxa"/>
+          </w:tcPr>
+          <w:p>
+            <w:pPr>
+              <w:pStyle w:val="Paragraphedeliste"/>
+              <w:ind w:left="0"/>
+              <w:rPr>
+                <w:b/>
+                <w:bCs/>
+              </w:rPr>
+            </w:pPr>
+            <w:r>
+              <w:rPr>
+                <w:b/>
+                <w:bCs/>
+              </w:rPr>
+              <w:t>Gravité (faible / moyenne / forte)</w:t>
+            </w:r>
+          </w:p>
+        </w:tc>
+      </w:tr>
+      <w:tr>
+        <w:tc>
+          <w:tcPr>
+            <w:tcW w:w="2121" w:type="dxa"/>
+          </w:tcPr>
+          <w:p>
+            <w:pPr>
+              <w:pStyle w:val="Paragraphedeliste"/>
+              <w:ind w:left="0"/>
+              <w:rPr>
+                <w:b/>
+                <w:bCs/>
+              </w:rPr>
+            </w:pPr>
+            <w:r>
+              <w:rPr>
+                <w:b/>
+                <w:bCs/>
+              </w:rPr>
+              <w:t>Complétude</w:t>
+            </w:r>
+          </w:p>
+          <w:p>
+            <w:pPr>
+              <w:pStyle w:val="Paragraphedeliste"/>
+              <w:ind w:left="0"/>
+              <w:rPr>
+                <w:b/>
+                <w:bCs/>
+              </w:rPr>
+            </w:pPr>
+          </w:p>
+        </w:tc>
+        <w:tc>
+          <w:tcPr>
+            <w:tcW w:w="2977" w:type="dxa"/>
+          </w:tcPr>
+          <w:p>
+            <w:pPr>
+              <w:pStyle w:val="Paragraphedeliste"/>
+              <w:ind w:left="0"/>
+            </w:pPr>
+            <w:r>
+              <w:t>NB.VIDE</w:t>
+            </w:r>
+            <w:r>
+              <w:t>, filtre sur (Vides)</w:t>
+            </w:r>
+          </w:p>
+        </w:tc>
+        <w:tc>
+          <w:tcPr>
+            <w:tcW w:w="1767" w:type="dxa"/>
+          </w:tcPr>
+          <w:p>
+            <w:pPr>
+              <w:pStyle w:val="Paragraphedeliste"/>
+              <w:ind w:left="0"/>
+            </w:pPr>
+            <w:r>
+              <w:t>Sur colonne « </w:t>
+            </w:r>
+            <w:r>
+              <w:t>prix gazole</w:t>
+            </w:r>
+            <w:r>
+              <w:t xml:space="preserve"> » </w:t>
+            </w:r>
+            <w:r>
+              <w:t xml:space="preserve">67 </w:t>
+            </w:r>
+            <w:r>
+              <w:t>entrées sont vides</w:t>
+            </w:r>
+          </w:p>
+        </w:tc>
+        <w:tc>
+          <w:tcPr>
+            <w:tcW w:w="1771" w:type="dxa"/>
+          </w:tcPr>
+          <w:p>
+            <w:pPr>
+              <w:pStyle w:val="Paragraphedeliste"/>
+              <w:ind w:left="0"/>
+            </w:pPr>
+            <w:r>
+              <w:t>Faible</w:t>
+            </w:r>
+          </w:p>
+        </w:tc>
+      </w:tr>
+      <w:tr>
+        <w:tc>
+          <w:tcPr>
+            <w:tcW w:w="2121" w:type="dxa"/>
+          </w:tcPr>
+          <w:p>
+            <w:pPr>
+              <w:pStyle w:val="Paragraphedeliste"/>
+              <w:ind w:left="0"/>
+              <w:rPr>
+                <w:b/>
+                <w:bCs/>
+              </w:rPr>
+            </w:pPr>
+            <w:r>
+              <w:rPr>
+                <w:b/>
+                <w:bCs/>
+              </w:rPr>
+              <w:t>Exactitude</w:t>
+            </w:r>
+          </w:p>
+        </w:tc>
+        <w:tc>
+          <w:tcPr>
+            <w:tcW w:w="2977" w:type="dxa"/>
+          </w:tcPr>
+          <w:p>
+            <w:pPr>
+              <w:pStyle w:val="Paragraphedeliste"/>
+              <w:ind w:left="0"/>
+            </w:pPr>
+            <w:r>
+              <w:t xml:space="preserve">Tri, MIN / MAX, valeurs </w:t>
+            </w:r>
+            <w:r>
+              <w:t>impassibles</w:t>
+            </w:r>
+            <w:r>
+              <w:tab/>
+            </w:r>
+          </w:p>
+        </w:tc>
+        <w:tc>
+          <w:tcPr>
+            <w:tcW w:w="1767" w:type="dxa"/>
+          </w:tcPr>
+          <w:p>
+            <w:pPr>
+              <w:pStyle w:val="Paragraphedeliste"/>
+              <w:ind w:left="0"/>
+            </w:pPr>
+            <w:r>
+              <w:t>MFC prix E10 1.99&lt;Prix&lt;2.50</w:t>
+            </w:r>
+          </w:p>
+        </w:tc>
+        <w:tc>
+          <w:tcPr>
+            <w:tcW w:w="1771" w:type="dxa"/>
+          </w:tcPr>
+          <w:p>
+            <w:pPr>
+              <w:pStyle w:val="Paragraphedeliste"/>
+              <w:ind w:left="0"/>
+            </w:pPr>
+            <w:r>
+              <w:t>6</w:t>
+            </w:r>
+            <w:r>
+              <w:t xml:space="preserve"> </w:t>
+            </w:r>
+            <w:r>
+              <w:t xml:space="preserve">valeurs = Faible </w:t>
+            </w:r>
+            <w:r>
+              <w:rPr>
+                <w:b/>
+                <w:bCs/>
+              </w:rPr>
+              <w:t xml:space="preserve">3,51 </w:t>
+            </w:r>
+            <w:r>
+              <w:rPr>
+                <w:b/>
+                <w:bCs/>
+              </w:rPr>
+              <w:t>%</w:t>
+            </w:r>
+          </w:p>
+        </w:tc>
+      </w:tr>
+      <w:tr>
+        <w:tc>
+          <w:tcPr>
+            <w:tcW w:w="2121" w:type="dxa"/>
+          </w:tcPr>
+          <w:p>
+            <w:pPr>
+              <w:rPr>
+                <w:b/>
+                <w:bCs/>
+              </w:rPr>
+            </w:pPr>
+            <w:r>
+              <w:rPr>
+                <w:b/>
+                <w:bCs/>
+              </w:rPr>
+              <w:t>Cohérence</w:t>
+            </w:r>
+          </w:p>
+        </w:tc>
+        <w:tc>
+          <w:tcPr>
+            <w:tcW w:w="2977" w:type="dxa"/>
+          </w:tcPr>
+          <w:p>
+            <w:pPr>
+              <w:pStyle w:val="Paragraphedeliste"/>
+              <w:ind w:left="0"/>
+            </w:pPr>
+            <w:r>
+              <w:t>Comparaison entre deux colonnes liées</w:t>
+            </w:r>
+            <w:r>
+              <w:tab/>
+            </w:r>
+          </w:p>
+        </w:tc>
+        <w:tc>
+          <w:tcPr>
+            <w:tcW w:w="1767" w:type="dxa"/>
+          </w:tcPr>
+          <w:p>
+            <w:pPr>
+              <w:pStyle w:val="Paragraphedeliste"/>
+              <w:ind w:left="0"/>
+            </w:pPr>
+            <w:r>
+              <w:t>=ET($AO1="</w:t>
+            </w:r>
+            <w:proofErr w:type="spellStart"/>
+            <w:r>
+              <w:t>Pas-de-calais</w:t>
+            </w:r>
+            <w:proofErr w:type="spellEnd"/>
+            <w:r>
+              <w:t>"; $AP1=</w:t>
+            </w:r>
+            <w:r>
+              <w:t>62</w:t>
+            </w:r>
+            <w:r>
+              <w:t>; $AQ1="Hauts-de-France")</w:t>
+            </w:r>
+          </w:p>
+        </w:tc>
+        <w:tc>
+          <w:tcPr>
+            <w:tcW w:w="1771" w:type="dxa"/>
+          </w:tcPr>
+          <w:p>
+            <w:pPr>
+              <w:pStyle w:val="Paragraphedeliste"/>
+              <w:ind w:left="0"/>
+            </w:pPr>
+            <w:r>
+              <w:t>Aucune erreur dans ma MFC</w:t>
+            </w:r>
+          </w:p>
+        </w:tc>
+      </w:tr>
+      <w:tr>
+        <w:tc>
+          <w:tcPr>
+            <w:tcW w:w="2121" w:type="dxa"/>
+          </w:tcPr>
+          <w:p>
+            <w:pPr>
+              <w:pStyle w:val="Paragraphedeliste"/>
+              <w:ind w:left="0"/>
+              <w:rPr>
+                <w:b/>
+                <w:bCs/>
+              </w:rPr>
+            </w:pPr>
+            <w:r>
+              <w:rPr>
+                <w:b/>
+                <w:bCs/>
+              </w:rPr>
+              <w:t>Validité</w:t>
+            </w:r>
+          </w:p>
+        </w:tc>
+        <w:tc>
+          <w:tcPr>
+            <w:tcW w:w="2977" w:type="dxa"/>
+          </w:tcPr>
+          <w:p>
+            <w:pPr>
+              <w:pStyle w:val="Paragraphedeliste"/>
+              <w:ind w:left="0"/>
+            </w:pPr>
+            <w:r>
+              <w:t>Filtre : formats hétérogènes dans une colonne</w:t>
+            </w:r>
+            <w:r>
+              <w:tab/>
+            </w:r>
+          </w:p>
+        </w:tc>
+        <w:tc>
+          <w:tcPr>
+            <w:tcW w:w="1767" w:type="dxa"/>
+          </w:tcPr>
+          <w:p>
+            <w:pPr>
+              <w:pStyle w:val="Paragraphedeliste"/>
+              <w:ind w:left="0"/>
+            </w:pPr>
+            <w:r>
+              <w:t>En excluant les NULL Toute la colonne possède des entrées dont le type est une valeur numérique</w:t>
+            </w:r>
+          </w:p>
+        </w:tc>
+        <w:tc>
+          <w:tcPr>
+            <w:tcW w:w="1771" w:type="dxa"/>
+          </w:tcPr>
+          <w:p>
+            <w:pPr>
+              <w:pStyle w:val="Paragraphedeliste"/>
+              <w:ind w:left="0"/>
+            </w:pPr>
+            <w:r>
+              <w:t>Aucune</w:t>
+            </w:r>
+          </w:p>
+        </w:tc>
+      </w:tr>
+      <w:tr>
+        <w:tc>
+          <w:tcPr>
+            <w:tcW w:w="2121" w:type="dxa"/>
+          </w:tcPr>
+          <w:p>
+            <w:pPr>
+              <w:rPr>
+                <w:b/>
+                <w:bCs/>
+              </w:rPr>
+            </w:pPr>
+            <w:r>
+              <w:rPr>
+                <w:b/>
+                <w:bCs/>
+              </w:rPr>
+              <w:t>Unicité</w:t>
+            </w:r>
+          </w:p>
+        </w:tc>
+        <w:tc>
+          <w:tcPr>
+            <w:tcW w:w="2977" w:type="dxa"/>
+          </w:tcPr>
+          <w:p>
+            <w:pPr>
+              <w:pStyle w:val="Paragraphedeliste"/>
+              <w:ind w:left="0"/>
+            </w:pPr>
+            <w:r>
+              <w:t>MFC Valeurs en double sur l'identifiant</w:t>
+            </w:r>
+            <w:r>
+              <w:tab/>
+            </w:r>
+          </w:p>
+        </w:tc>
+        <w:tc>
+          <w:tcPr>
+            <w:tcW w:w="1767" w:type="dxa"/>
+          </w:tcPr>
+          <w:p>
+            <w:pPr>
+              <w:pStyle w:val="Paragraphedeliste"/>
+              <w:ind w:left="0"/>
+            </w:pPr>
+            <w:r>
+              <w:t xml:space="preserve">MFC </w:t>
+            </w:r>
+            <w:r>
+              <w:t>=NB.SI(A:A; A1) &gt; 1</w:t>
+            </w:r>
+            <w:r>
+              <w:t>. Aucune sélection par couleur possible, donc aucun dou</w:t>
+            </w:r>
+            <w:r>
+              <w:t>blon.</w:t>
+            </w:r>
+          </w:p>
+        </w:tc>
+        <w:tc>
+          <w:tcPr>
+            <w:tcW w:w="1771" w:type="dxa"/>
+          </w:tcPr>
+          <w:p>
+            <w:pPr>
+              <w:pStyle w:val="Paragraphedeliste"/>
+              <w:ind w:left="0"/>
+            </w:pPr>
+            <w:r>
+              <w:t>Aucune</w:t>
+            </w:r>
+          </w:p>
+        </w:tc>
+      </w:tr>
+      <w:tr>
+        <w:tc>
+          <w:tcPr>
+            <w:tcW w:w="2121" w:type="dxa"/>
+          </w:tcPr>
+          <w:p>
+            <w:pPr>
+              <w:pStyle w:val="Paragraphedeliste"/>
+              <w:ind w:left="0"/>
+              <w:rPr>
+                <w:b/>
+                <w:bCs/>
+              </w:rPr>
+            </w:pPr>
+            <w:r>
+              <w:rPr>
+                <w:b/>
+                <w:bCs/>
+              </w:rPr>
+              <w:t>Fraîcheur</w:t>
+            </w:r>
+          </w:p>
+        </w:tc>
+        <w:tc>
+          <w:tcPr>
+            <w:tcW w:w="2977" w:type="dxa"/>
+          </w:tcPr>
+          <w:p>
+            <w:pPr>
+              <w:pStyle w:val="Paragraphedeliste"/>
+              <w:ind w:left="0"/>
+            </w:pPr>
+            <w:r>
+              <w:t>Date la plus récente vs date du jour</w:t>
+            </w:r>
+            <w:r>
+              <w:tab/>
+            </w:r>
+          </w:p>
+        </w:tc>
+        <w:tc>
+          <w:tcPr>
+            <w:tcW w:w="1767" w:type="dxa"/>
+          </w:tcPr>
+          <w:p>
+            <w:pPr>
+              <w:pStyle w:val="Paragraphedeliste"/>
+              <w:ind w:left="0"/>
+            </w:pPr>
+            <w:r>
+              <w:t xml:space="preserve">Actualisation du Prix du Gazole le plus récent date de </w:t>
+            </w:r>
+            <w:r>
+              <w:t>05</w:t>
+            </w:r>
+            <w:r>
+              <w:t>h</w:t>
+            </w:r>
+            <w:r>
+              <w:t>39</w:t>
+            </w:r>
+            <w:r>
+              <w:t xml:space="preserve"> ce matin, et la moins récente du </w:t>
+            </w:r>
+            <w:r>
+              <w:t>2026-07-24</w:t>
+            </w:r>
+            <w:r>
+              <w:t xml:space="preserve"> à </w:t>
+            </w:r>
+            <w:r>
+              <w:t>09:01:30</w:t>
+            </w:r>
+          </w:p>
+        </w:tc>
+        <w:tc>
+          <w:tcPr>
+            <w:tcW w:w="1771" w:type="dxa"/>
+          </w:tcPr>
+          <w:p>
+            <w:pPr>
+              <w:pStyle w:val="Paragraphedeliste"/>
+              <w:ind w:left="0"/>
+            </w:pPr>
+          </w:p>
+        </w:tc>
+      </w:tr>
+    </w:tbl>
+    <w:p>
+      <w:pPr>
+        <w:pStyle w:val="Paragraphedeliste"/>
+      </w:pPr>
+    </w:p>
+    <w:p>
+      <w:pPr>
+        <w:pStyle w:val="Paragraphedeliste"/>
+      </w:pPr>
+      <w:r>
+        <w:t xml:space="preserve">Suppression des colonnes Longitudes, Latitude, 2 colonnes vides pour plus de lisibilité. </w:t>
+      </w:r>
+    </w:p>
+    <w:p>
+      <w:pPr>
+        <w:pStyle w:val="Paragraphedeliste"/>
+      </w:pPr>
+    </w:p>
+    <w:p>
+      <w:pPr>
+        <w:pStyle w:val="Paragraphedeliste"/>
+        <w:rPr>
+          <w:b/>
+          <w:bCs/>
+        </w:rPr>
+      </w:pPr>
+      <w:r>
+        <w:rPr>
+          <w:b/>
+          <w:bCs/>
+        </w:rPr>
+        <w:lastRenderedPageBreak/>
+        <w:t>4. Proposer des usages (15 min)</w:t>
+      </w:r>
+    </w:p>
+    <w:p>
+      <w:pPr>
+        <w:pStyle w:val="Paragraphedeliste"/>
+      </w:pPr>
+      <w:r>
+        <w:t>Proposez </w:t>
+      </w:r>
+      <w:r>
+        <w:rPr>
+          <w:b/>
+          <w:bCs/>
+        </w:rPr>
+        <w:t>deux usages</w:t>
+      </w:r>
+      <w:r>
+        <w:t> de ce jeu pour l'agence. Pour chacun :</w:t>
+      </w:r>
+    </w:p>
+    <w:p>
+      <w:pPr>
+        <w:pStyle w:val="Paragraphedeliste"/>
+        <w:numPr>
+          <w:ilvl w:val="0"/>
+          <w:numId w:val="2"/>
+        </w:numPr>
+      </w:pPr>
+      <w:r>
+        <w:t>la question métier à laquelle il répond ;</w:t>
+      </w:r>
+    </w:p>
+    <w:p>
+      <w:pPr>
+        <w:pStyle w:val="Paragraphedeliste"/>
+        <w:numPr>
+          <w:ilvl w:val="0"/>
+          <w:numId w:val="2"/>
+        </w:numPr>
+      </w:pPr>
+      <w:r>
+        <w:t>la ou les colonnes utilisées ;</w:t>
+      </w:r>
+    </w:p>
+    <w:p>
+      <w:pPr>
+        <w:pStyle w:val="Paragraphedeliste"/>
+        <w:numPr>
+          <w:ilvl w:val="0"/>
+          <w:numId w:val="2"/>
+        </w:numPr>
+      </w:pPr>
+      <w:r>
+        <w:t>le défaut qualité qui pourrait fausser la réponse.</w:t>
+      </w:r>
+    </w:p>
+    <w:p>
+      <w:pPr>
+        <w:rPr>
+          <w:b/>
+          <w:bCs/>
+        </w:rPr>
+      </w:pPr>
+      <w:r>
+        <w:rPr>
+          <w:b/>
+          <w:bCs/>
+        </w:rPr>
+        <w:t>5. Parcours + uniquement : croiser deux sources (en autonomie)</w:t>
+      </w:r>
+    </w:p>
+    <w:p>
+      <w:r>
+        <w:t>Trouvez une seconde source pour un même indicateur (ex. population communale INSEE vs portail régional). Comparez les valeurs sur 5 lignes et expliquez les écarts éventuels.</w:t>
+      </w:r>
+    </w:p>
+    <w:p>
+      <w:pPr>
+        <w:rPr>
+          <w:b/>
+          <w:bCs/>
+        </w:rPr>
+      </w:pPr>
+      <w:r>
+        <w:rPr>
+          <w:b/>
+          <w:bCs/>
+        </w:rPr>
+        <w:t>6. Versionner (10 min)</w:t>
+      </w:r>
+    </w:p>
+    <w:p>
+      <w:r>
+        <w:t>Dans votre dépôt GitHub :</w:t>
+      </w:r>
+    </w:p>
+    <w:p>
+      <w:pPr>
+        <w:numPr>
+          <w:ilvl w:val="0"/>
+          <w:numId w:val="3"/>
+        </w:numPr>
+      </w:pPr>
+      <w:r>
+        <w:t>ajoutez la grille et vos notes dans un fichier audit_qualite.md ;</w:t>
+      </w:r>
+    </w:p>
+    <w:p>
+      <w:pPr>
+        <w:numPr>
+          <w:ilvl w:val="0"/>
+          <w:numId w:val="3"/>
+        </w:numPr>
+      </w:pPr>
+      <w:r>
+        <w:t>faites au moins un commit avec un message explicite (ex. Ajout grille qualité carburants 62).</w:t>
+      </w:r>
+    </w:p>
+    <w:p>
+      <w:pPr>
+        <w:rPr>
+          <w:b/>
+          <w:bCs/>
+        </w:rPr>
+      </w:pPr>
+      <w:r>
+        <w:rPr>
+          <w:b/>
+          <w:bCs/>
+        </w:rPr>
+        <w:t>Critères de réussite (C1.1 · niveau 1)</w:t>
+      </w:r>
+    </w:p>
+    <w:p>
+      <w:pPr>
+        <w:numPr>
+          <w:ilvl w:val="0"/>
+          <w:numId w:val="4"/>
+        </w:numPr>
+      </w:pPr>
+      <w:r>
+        <w:t>[ ] La fiche d'identité est complète : source, licence et date de mise à jour sont renseignées.</w:t>
+      </w:r>
+    </w:p>
+    <w:p>
+      <w:pPr>
+        <w:numPr>
+          <w:ilvl w:val="0"/>
+          <w:numId w:val="4"/>
+        </w:numPr>
+      </w:pPr>
+      <w:r>
+        <w:t>[ ] Les 6 dimensions de la grille sont renseignées, chacune avec un constat précis.</w:t>
+      </w:r>
+    </w:p>
+    <w:p>
+      <w:pPr>
+        <w:numPr>
+          <w:ilvl w:val="0"/>
+          <w:numId w:val="4"/>
+        </w:numPr>
+      </w:pPr>
+      <w:r>
+        <w:t>[ ] Au moins deux usages sont proposés et reliés à des colonnes réelles du jeu.</w:t>
+      </w:r>
+    </w:p>
+    <w:p>
+      <w:pPr>
+        <w:numPr>
+          <w:ilvl w:val="0"/>
+          <w:numId w:val="4"/>
+        </w:numPr>
+      </w:pPr>
+      <w:r>
+        <w:t xml:space="preserve">[ ] Le travail est </w:t>
+      </w:r>
+      <w:proofErr w:type="spellStart"/>
+      <w:r>
+        <w:t>commité</w:t>
+      </w:r>
+      <w:proofErr w:type="spellEnd"/>
+      <w:r>
+        <w:t xml:space="preserve"> sur GitHub.</w:t>
+      </w:r>
+    </w:p>
+    <w:p/>
+    <w:p>
+      <w:pPr>
+        <w:pStyle w:val="Paragraphedeliste"/>
+      </w:pPr>
+    </w:p>
     <w:sectPr>
       <w:pgSz w:w="11906" w:h="16838"/>
       <w:pgMar w:top="1417" w:right="1417" w:bottom="1417" w:left="1417" w:header="708" w:footer="708" w:gutter="0"/>
@@ -263,6 +1454,583 @@
     </w:sectPr>
   </w:body>
 </w:document>
+</file>
+
+<file path=word/numbering.xml><?xml version="1.0" encoding="utf-8"?>
+<w:numbering xmlns:wpc="http://schemas.microsoft.com/office/word/2010/wordprocessingCanvas" xmlns:cx="http://schemas.microsoft.com/office/drawing/2014/chartex" xmlns:cx1="http://schemas.microsoft.com/office/drawing/2015/9/8/chartex" xmlns:cx2="http://schemas.microsoft.com/office/drawing/2015/10/21/chartex" xmlns:cx3="http://schemas.microsoft.com/office/drawing/2016/5/9/chartex" xmlns:cx4="http://schemas.microsoft.com/office/drawing/2016/5/10/chartex" xmlns:cx5="http://schemas.microsoft.com/office/drawing/2016/5/11/chartex" xmlns:cx6="http://schemas.microsoft.com/office/drawing/2016/5/12/chartex" xmlns:cx7="http://schemas.microsoft.com/office/drawing/2016/5/13/chartex" xmlns:cx8="http://schemas.microsoft.com/office/drawing/2016/5/14/chartex" xmlns:mc="http://schemas.openxmlformats.org/markup-compatibility/2006" xmlns:aink="http://schemas.microsoft.com/office/drawing/2016/ink" xmlns:am3d="http://schemas.microsoft.com/office/drawing/2017/model3d" xmlns:o="urn:schemas-microsoft-com:office:office" xmlns:oel="http://schemas.microsoft.com/office/2019/extlst" xmlns:r="http://schemas.openxmlformats.org/officeDocument/2006/relationships" xmlns:m="http://schemas.openxmlformats.org/officeDocument/2006/math" xmlns:v="urn:schemas-microsoft-com:vml" xmlns:wp14="http://schemas.microsoft.com/office/word/2010/wordprocessingDrawing" xmlns:wp="http://schemas.openxmlformats.org/drawingml/2006/wordprocessingDrawing" xmlns:w10="urn:schemas-microsoft-com:office:word" xmlns:w="http://schemas.openxmlformats.org/wordprocessingml/2006/main" xmlns:w14="http://schemas.microsoft.com/office/word/2010/wordml" xmlns:w15="http://schemas.microsoft.com/office/word/2012/wordml" xmlns:w16cex="http://schemas.microsoft.com/office/word/2018/wordml/cex" xmlns:w16cid="http://schemas.microsoft.com/office/word/2016/wordml/cid" xmlns:w16="http://schemas.microsoft.com/office/word/2018/wordml" xmlns:w16sdtdh="http://schemas.microsoft.com/office/word/2020/wordml/sdtdatahash" xmlns:w16se="http://schemas.microsoft.com/office/word/2015/wordml/symex" xmlns:wpg="http://schemas.microsoft.com/office/word/2010/wordprocessingGroup" xmlns:wpi="http://schemas.microsoft.com/office/word/2010/wordprocessingInk" xmlns:wne="http://schemas.microsoft.com/office/word/2006/wordml" xmlns:wps="http://schemas.microsoft.com/office/word/2010/wordprocessingShape" mc:Ignorable="w14 w15 w16se w16cid w16 w16cex w16sdtdh wp14">
+  <w:abstractNum w:abstractNumId="0" w15:restartNumberingAfterBreak="0">
+    <w:nsid w:val="45230838"/>
+    <w:multiLevelType w:val="multilevel"/>
+    <w:tmpl w:val="FF4E1A90"/>
+    <w:lvl w:ilvl="0">
+      <w:start w:val="1"/>
+      <w:numFmt w:val="bullet"/>
+      <w:lvlText w:val=""/>
+      <w:lvlJc w:val="left"/>
+      <w:pPr>
+        <w:tabs>
+          <w:tab w:val="num" w:pos="720"/>
+        </w:tabs>
+        <w:ind w:left="720" w:hanging="360"/>
+      </w:pPr>
+      <w:rPr>
+        <w:rFonts w:ascii="Symbol" w:hAnsi="Symbol" w:hint="default"/>
+        <w:sz w:val="20"/>
+      </w:rPr>
+    </w:lvl>
+    <w:lvl w:ilvl="1" w:tentative="1">
+      <w:start w:val="1"/>
+      <w:numFmt w:val="bullet"/>
+      <w:lvlText w:val="o"/>
+      <w:lvlJc w:val="left"/>
+      <w:pPr>
+        <w:tabs>
+          <w:tab w:val="num" w:pos="1440"/>
+        </w:tabs>
+        <w:ind w:left="1440" w:hanging="360"/>
+      </w:pPr>
+      <w:rPr>
+        <w:rFonts w:ascii="Courier New" w:hAnsi="Courier New" w:hint="default"/>
+        <w:sz w:val="20"/>
+      </w:rPr>
+    </w:lvl>
+    <w:lvl w:ilvl="2" w:tentative="1">
+      <w:start w:val="1"/>
+      <w:numFmt w:val="bullet"/>
+      <w:lvlText w:val=""/>
+      <w:lvlJc w:val="left"/>
+      <w:pPr>
+        <w:tabs>
+          <w:tab w:val="num" w:pos="2160"/>
+        </w:tabs>
+        <w:ind w:left="2160" w:hanging="360"/>
+      </w:pPr>
+      <w:rPr>
+        <w:rFonts w:ascii="Wingdings" w:hAnsi="Wingdings" w:hint="default"/>
+        <w:sz w:val="20"/>
+      </w:rPr>
+    </w:lvl>
+    <w:lvl w:ilvl="3" w:tentative="1">
+      <w:start w:val="1"/>
+      <w:numFmt w:val="bullet"/>
+      <w:lvlText w:val=""/>
+      <w:lvlJc w:val="left"/>
+      <w:pPr>
+        <w:tabs>
+          <w:tab w:val="num" w:pos="2880"/>
+        </w:tabs>
+        <w:ind w:left="2880" w:hanging="360"/>
+      </w:pPr>
+      <w:rPr>
+        <w:rFonts w:ascii="Wingdings" w:hAnsi="Wingdings" w:hint="default"/>
+        <w:sz w:val="20"/>
+      </w:rPr>
+    </w:lvl>
+    <w:lvl w:ilvl="4" w:tentative="1">
+      <w:start w:val="1"/>
+      <w:numFmt w:val="bullet"/>
+      <w:lvlText w:val=""/>
+      <w:lvlJc w:val="left"/>
+      <w:pPr>
+        <w:tabs>
+          <w:tab w:val="num" w:pos="3600"/>
+        </w:tabs>
+        <w:ind w:left="3600" w:hanging="360"/>
+      </w:pPr>
+      <w:rPr>
+        <w:rFonts w:ascii="Wingdings" w:hAnsi="Wingdings" w:hint="default"/>
+        <w:sz w:val="20"/>
+      </w:rPr>
+    </w:lvl>
+    <w:lvl w:ilvl="5" w:tentative="1">
+      <w:start w:val="1"/>
+      <w:numFmt w:val="bullet"/>
+      <w:lvlText w:val=""/>
+      <w:lvlJc w:val="left"/>
+      <w:pPr>
+        <w:tabs>
+          <w:tab w:val="num" w:pos="4320"/>
+        </w:tabs>
+        <w:ind w:left="4320" w:hanging="360"/>
+      </w:pPr>
+      <w:rPr>
+        <w:rFonts w:ascii="Wingdings" w:hAnsi="Wingdings" w:hint="default"/>
+        <w:sz w:val="20"/>
+      </w:rPr>
+    </w:lvl>
+    <w:lvl w:ilvl="6" w:tentative="1">
+      <w:start w:val="1"/>
+      <w:numFmt w:val="bullet"/>
+      <w:lvlText w:val=""/>
+      <w:lvlJc w:val="left"/>
+      <w:pPr>
+        <w:tabs>
+          <w:tab w:val="num" w:pos="5040"/>
+        </w:tabs>
+        <w:ind w:left="5040" w:hanging="360"/>
+      </w:pPr>
+      <w:rPr>
+        <w:rFonts w:ascii="Wingdings" w:hAnsi="Wingdings" w:hint="default"/>
+        <w:sz w:val="20"/>
+      </w:rPr>
+    </w:lvl>
+    <w:lvl w:ilvl="7" w:tentative="1">
+      <w:start w:val="1"/>
+      <w:numFmt w:val="bullet"/>
+      <w:lvlText w:val=""/>
+      <w:lvlJc w:val="left"/>
+      <w:pPr>
+        <w:tabs>
+          <w:tab w:val="num" w:pos="5760"/>
+        </w:tabs>
+        <w:ind w:left="5760" w:hanging="360"/>
+      </w:pPr>
+      <w:rPr>
+        <w:rFonts w:ascii="Wingdings" w:hAnsi="Wingdings" w:hint="default"/>
+        <w:sz w:val="20"/>
+      </w:rPr>
+    </w:lvl>
+    <w:lvl w:ilvl="8" w:tentative="1">
+      <w:start w:val="1"/>
+      <w:numFmt w:val="bullet"/>
+      <w:lvlText w:val=""/>
+      <w:lvlJc w:val="left"/>
+      <w:pPr>
+        <w:tabs>
+          <w:tab w:val="num" w:pos="6480"/>
+        </w:tabs>
+        <w:ind w:left="6480" w:hanging="360"/>
+      </w:pPr>
+      <w:rPr>
+        <w:rFonts w:ascii="Wingdings" w:hAnsi="Wingdings" w:hint="default"/>
+        <w:sz w:val="20"/>
+      </w:rPr>
+    </w:lvl>
+  </w:abstractNum>
+  <w:abstractNum w:abstractNumId="1" w15:restartNumberingAfterBreak="0">
+    <w:nsid w:val="634B7C35"/>
+    <w:multiLevelType w:val="multilevel"/>
+    <w:tmpl w:val="849A8752"/>
+    <w:lvl w:ilvl="0">
+      <w:start w:val="1"/>
+      <w:numFmt w:val="bullet"/>
+      <w:lvlText w:val=""/>
+      <w:lvlJc w:val="left"/>
+      <w:pPr>
+        <w:tabs>
+          <w:tab w:val="num" w:pos="720"/>
+        </w:tabs>
+        <w:ind w:left="720" w:hanging="360"/>
+      </w:pPr>
+      <w:rPr>
+        <w:rFonts w:ascii="Symbol" w:hAnsi="Symbol" w:hint="default"/>
+        <w:sz w:val="20"/>
+      </w:rPr>
+    </w:lvl>
+    <w:lvl w:ilvl="1" w:tentative="1">
+      <w:start w:val="1"/>
+      <w:numFmt w:val="bullet"/>
+      <w:lvlText w:val="o"/>
+      <w:lvlJc w:val="left"/>
+      <w:pPr>
+        <w:tabs>
+          <w:tab w:val="num" w:pos="1440"/>
+        </w:tabs>
+        <w:ind w:left="1440" w:hanging="360"/>
+      </w:pPr>
+      <w:rPr>
+        <w:rFonts w:ascii="Courier New" w:hAnsi="Courier New" w:hint="default"/>
+        <w:sz w:val="20"/>
+      </w:rPr>
+    </w:lvl>
+    <w:lvl w:ilvl="2" w:tentative="1">
+      <w:start w:val="1"/>
+      <w:numFmt w:val="bullet"/>
+      <w:lvlText w:val=""/>
+      <w:lvlJc w:val="left"/>
+      <w:pPr>
+        <w:tabs>
+          <w:tab w:val="num" w:pos="2160"/>
+        </w:tabs>
+        <w:ind w:left="2160" w:hanging="360"/>
+      </w:pPr>
+      <w:rPr>
+        <w:rFonts w:ascii="Wingdings" w:hAnsi="Wingdings" w:hint="default"/>
+        <w:sz w:val="20"/>
+      </w:rPr>
+    </w:lvl>
+    <w:lvl w:ilvl="3" w:tentative="1">
+      <w:start w:val="1"/>
+      <w:numFmt w:val="bullet"/>
+      <w:lvlText w:val=""/>
+      <w:lvlJc w:val="left"/>
+      <w:pPr>
+        <w:tabs>
+          <w:tab w:val="num" w:pos="2880"/>
+        </w:tabs>
+        <w:ind w:left="2880" w:hanging="360"/>
+      </w:pPr>
+      <w:rPr>
+        <w:rFonts w:ascii="Wingdings" w:hAnsi="Wingdings" w:hint="default"/>
+        <w:sz w:val="20"/>
+      </w:rPr>
+    </w:lvl>
+    <w:lvl w:ilvl="4" w:tentative="1">
+      <w:start w:val="1"/>
+      <w:numFmt w:val="bullet"/>
+      <w:lvlText w:val=""/>
+      <w:lvlJc w:val="left"/>
+      <w:pPr>
+        <w:tabs>
+          <w:tab w:val="num" w:pos="3600"/>
+        </w:tabs>
+        <w:ind w:left="3600" w:hanging="360"/>
+      </w:pPr>
+      <w:rPr>
+        <w:rFonts w:ascii="Wingdings" w:hAnsi="Wingdings" w:hint="default"/>
+        <w:sz w:val="20"/>
+      </w:rPr>
+    </w:lvl>
+    <w:lvl w:ilvl="5" w:tentative="1">
+      <w:start w:val="1"/>
+      <w:numFmt w:val="bullet"/>
+      <w:lvlText w:val=""/>
+      <w:lvlJc w:val="left"/>
+      <w:pPr>
+        <w:tabs>
+          <w:tab w:val="num" w:pos="4320"/>
+        </w:tabs>
+        <w:ind w:left="4320" w:hanging="360"/>
+      </w:pPr>
+      <w:rPr>
+        <w:rFonts w:ascii="Wingdings" w:hAnsi="Wingdings" w:hint="default"/>
+        <w:sz w:val="20"/>
+      </w:rPr>
+    </w:lvl>
+    <w:lvl w:ilvl="6" w:tentative="1">
+      <w:start w:val="1"/>
+      <w:numFmt w:val="bullet"/>
+      <w:lvlText w:val=""/>
+      <w:lvlJc w:val="left"/>
+      <w:pPr>
+        <w:tabs>
+          <w:tab w:val="num" w:pos="5040"/>
+        </w:tabs>
+        <w:ind w:left="5040" w:hanging="360"/>
+      </w:pPr>
+      <w:rPr>
+        <w:rFonts w:ascii="Wingdings" w:hAnsi="Wingdings" w:hint="default"/>
+        <w:sz w:val="20"/>
+      </w:rPr>
+    </w:lvl>
+    <w:lvl w:ilvl="7" w:tentative="1">
+      <w:start w:val="1"/>
+      <w:numFmt w:val="bullet"/>
+      <w:lvlText w:val=""/>
+      <w:lvlJc w:val="left"/>
+      <w:pPr>
+        <w:tabs>
+          <w:tab w:val="num" w:pos="5760"/>
+        </w:tabs>
+        <w:ind w:left="5760" w:hanging="360"/>
+      </w:pPr>
+      <w:rPr>
+        <w:rFonts w:ascii="Wingdings" w:hAnsi="Wingdings" w:hint="default"/>
+        <w:sz w:val="20"/>
+      </w:rPr>
+    </w:lvl>
+    <w:lvl w:ilvl="8" w:tentative="1">
+      <w:start w:val="1"/>
+      <w:numFmt w:val="bullet"/>
+      <w:lvlText w:val=""/>
+      <w:lvlJc w:val="left"/>
+      <w:pPr>
+        <w:tabs>
+          <w:tab w:val="num" w:pos="6480"/>
+        </w:tabs>
+        <w:ind w:left="6480" w:hanging="360"/>
+      </w:pPr>
+      <w:rPr>
+        <w:rFonts w:ascii="Wingdings" w:hAnsi="Wingdings" w:hint="default"/>
+        <w:sz w:val="20"/>
+      </w:rPr>
+    </w:lvl>
+  </w:abstractNum>
+  <w:abstractNum w:abstractNumId="2" w15:restartNumberingAfterBreak="0">
+    <w:nsid w:val="73B70A9A"/>
+    <w:multiLevelType w:val="hybridMultilevel"/>
+    <w:tmpl w:val="0D20E8B8"/>
+    <w:lvl w:ilvl="0" w:tplc="2AB253B8">
+      <w:start w:val="2"/>
+      <w:numFmt w:val="bullet"/>
+      <w:lvlText w:val="-"/>
+      <w:lvlJc w:val="left"/>
+      <w:pPr>
+        <w:ind w:left="720" w:hanging="360"/>
+      </w:pPr>
+      <w:rPr>
+        <w:rFonts w:ascii="Aptos" w:eastAsiaTheme="minorHAnsi" w:hAnsi="Aptos" w:cstheme="minorBidi" w:hint="default"/>
+      </w:rPr>
+    </w:lvl>
+    <w:lvl w:ilvl="1" w:tplc="040C0003">
+      <w:start w:val="1"/>
+      <w:numFmt w:val="bullet"/>
+      <w:lvlText w:val="o"/>
+      <w:lvlJc w:val="left"/>
+      <w:pPr>
+        <w:ind w:left="1440" w:hanging="360"/>
+      </w:pPr>
+      <w:rPr>
+        <w:rFonts w:ascii="Courier New" w:hAnsi="Courier New" w:cs="Courier New" w:hint="default"/>
+      </w:rPr>
+    </w:lvl>
+    <w:lvl w:ilvl="2" w:tplc="040C0005" w:tentative="1">
+      <w:start w:val="1"/>
+      <w:numFmt w:val="bullet"/>
+      <w:lvlText w:val=""/>
+      <w:lvlJc w:val="left"/>
+      <w:pPr>
+        <w:ind w:left="2160" w:hanging="360"/>
+      </w:pPr>
+      <w:rPr>
+        <w:rFonts w:ascii="Wingdings" w:hAnsi="Wingdings" w:hint="default"/>
+      </w:rPr>
+    </w:lvl>
+    <w:lvl w:ilvl="3" w:tplc="040C0001" w:tentative="1">
+      <w:start w:val="1"/>
+      <w:numFmt w:val="bullet"/>
+      <w:lvlText w:val=""/>
+      <w:lvlJc w:val="left"/>
+      <w:pPr>
+        <w:ind w:left="2880" w:hanging="360"/>
+      </w:pPr>
+      <w:rPr>
+        <w:rFonts w:ascii="Symbol" w:hAnsi="Symbol" w:hint="default"/>
+      </w:rPr>
+    </w:lvl>
+    <w:lvl w:ilvl="4" w:tplc="040C0003" w:tentative="1">
+      <w:start w:val="1"/>
+      <w:numFmt w:val="bullet"/>
+      <w:lvlText w:val="o"/>
+      <w:lvlJc w:val="left"/>
+      <w:pPr>
+        <w:ind w:left="3600" w:hanging="360"/>
+      </w:pPr>
+      <w:rPr>
+        <w:rFonts w:ascii="Courier New" w:hAnsi="Courier New" w:cs="Courier New" w:hint="default"/>
+      </w:rPr>
+    </w:lvl>
+    <w:lvl w:ilvl="5" w:tplc="040C0005" w:tentative="1">
+      <w:start w:val="1"/>
+      <w:numFmt w:val="bullet"/>
+      <w:lvlText w:val=""/>
+      <w:lvlJc w:val="left"/>
+      <w:pPr>
+        <w:ind w:left="4320" w:hanging="360"/>
+      </w:pPr>
+      <w:rPr>
+        <w:rFonts w:ascii="Wingdings" w:hAnsi="Wingdings" w:hint="default"/>
+      </w:rPr>
+    </w:lvl>
+    <w:lvl w:ilvl="6" w:tplc="040C0001" w:tentative="1">
+      <w:start w:val="1"/>
+      <w:numFmt w:val="bullet"/>
+      <w:lvlText w:val=""/>
+      <w:lvlJc w:val="left"/>
+      <w:pPr>
+        <w:ind w:left="5040" w:hanging="360"/>
+      </w:pPr>
+      <w:rPr>
+        <w:rFonts w:ascii="Symbol" w:hAnsi="Symbol" w:hint="default"/>
+      </w:rPr>
+    </w:lvl>
+    <w:lvl w:ilvl="7" w:tplc="040C0003" w:tentative="1">
+      <w:start w:val="1"/>
+      <w:numFmt w:val="bullet"/>
+      <w:lvlText w:val="o"/>
+      <w:lvlJc w:val="left"/>
+      <w:pPr>
+        <w:ind w:left="5760" w:hanging="360"/>
+      </w:pPr>
+      <w:rPr>
+        <w:rFonts w:ascii="Courier New" w:hAnsi="Courier New" w:cs="Courier New" w:hint="default"/>
+      </w:rPr>
+    </w:lvl>
+    <w:lvl w:ilvl="8" w:tplc="040C0005" w:tentative="1">
+      <w:start w:val="1"/>
+      <w:numFmt w:val="bullet"/>
+      <w:lvlText w:val=""/>
+      <w:lvlJc w:val="left"/>
+      <w:pPr>
+        <w:ind w:left="6480" w:hanging="360"/>
+      </w:pPr>
+      <w:rPr>
+        <w:rFonts w:ascii="Wingdings" w:hAnsi="Wingdings" w:hint="default"/>
+      </w:rPr>
+    </w:lvl>
+  </w:abstractNum>
+  <w:abstractNum w:abstractNumId="3" w15:restartNumberingAfterBreak="0">
+    <w:nsid w:val="759E0F65"/>
+    <w:multiLevelType w:val="multilevel"/>
+    <w:tmpl w:val="AFAABA4C"/>
+    <w:lvl w:ilvl="0">
+      <w:start w:val="1"/>
+      <w:numFmt w:val="bullet"/>
+      <w:lvlText w:val=""/>
+      <w:lvlJc w:val="left"/>
+      <w:pPr>
+        <w:tabs>
+          <w:tab w:val="num" w:pos="720"/>
+        </w:tabs>
+        <w:ind w:left="720" w:hanging="360"/>
+      </w:pPr>
+      <w:rPr>
+        <w:rFonts w:ascii="Symbol" w:hAnsi="Symbol" w:hint="default"/>
+        <w:sz w:val="20"/>
+      </w:rPr>
+    </w:lvl>
+    <w:lvl w:ilvl="1" w:tentative="1">
+      <w:start w:val="1"/>
+      <w:numFmt w:val="bullet"/>
+      <w:lvlText w:val="o"/>
+      <w:lvlJc w:val="left"/>
+      <w:pPr>
+        <w:tabs>
+          <w:tab w:val="num" w:pos="1440"/>
+        </w:tabs>
+        <w:ind w:left="1440" w:hanging="360"/>
+      </w:pPr>
+      <w:rPr>
+        <w:rFonts w:ascii="Courier New" w:hAnsi="Courier New" w:hint="default"/>
+        <w:sz w:val="20"/>
+      </w:rPr>
+    </w:lvl>
+    <w:lvl w:ilvl="2" w:tentative="1">
+      <w:start w:val="1"/>
+      <w:numFmt w:val="bullet"/>
+      <w:lvlText w:val=""/>
+      <w:lvlJc w:val="left"/>
+      <w:pPr>
+        <w:tabs>
+          <w:tab w:val="num" w:pos="2160"/>
+        </w:tabs>
+        <w:ind w:left="2160" w:hanging="360"/>
+      </w:pPr>
+      <w:rPr>
+        <w:rFonts w:ascii="Wingdings" w:hAnsi="Wingdings" w:hint="default"/>
+        <w:sz w:val="20"/>
+      </w:rPr>
+    </w:lvl>
+    <w:lvl w:ilvl="3" w:tentative="1">
+      <w:start w:val="1"/>
+      <w:numFmt w:val="bullet"/>
+      <w:lvlText w:val=""/>
+      <w:lvlJc w:val="left"/>
+      <w:pPr>
+        <w:tabs>
+          <w:tab w:val="num" w:pos="2880"/>
+        </w:tabs>
+        <w:ind w:left="2880" w:hanging="360"/>
+      </w:pPr>
+      <w:rPr>
+        <w:rFonts w:ascii="Wingdings" w:hAnsi="Wingdings" w:hint="default"/>
+        <w:sz w:val="20"/>
+      </w:rPr>
+    </w:lvl>
+    <w:lvl w:ilvl="4" w:tentative="1">
+      <w:start w:val="1"/>
+      <w:numFmt w:val="bullet"/>
+      <w:lvlText w:val=""/>
+      <w:lvlJc w:val="left"/>
+      <w:pPr>
+        <w:tabs>
+          <w:tab w:val="num" w:pos="3600"/>
+        </w:tabs>
+        <w:ind w:left="3600" w:hanging="360"/>
+      </w:pPr>
+      <w:rPr>
+        <w:rFonts w:ascii="Wingdings" w:hAnsi="Wingdings" w:hint="default"/>
+        <w:sz w:val="20"/>
+      </w:rPr>
+    </w:lvl>
+    <w:lvl w:ilvl="5" w:tentative="1">
+      <w:start w:val="1"/>
+      <w:numFmt w:val="bullet"/>
+      <w:lvlText w:val=""/>
+      <w:lvlJc w:val="left"/>
+      <w:pPr>
+        <w:tabs>
+          <w:tab w:val="num" w:pos="4320"/>
+        </w:tabs>
+        <w:ind w:left="4320" w:hanging="360"/>
+      </w:pPr>
+      <w:rPr>
+        <w:rFonts w:ascii="Wingdings" w:hAnsi="Wingdings" w:hint="default"/>
+        <w:sz w:val="20"/>
+      </w:rPr>
+    </w:lvl>
+    <w:lvl w:ilvl="6" w:tentative="1">
+      <w:start w:val="1"/>
+      <w:numFmt w:val="bullet"/>
+      <w:lvlText w:val=""/>
+      <w:lvlJc w:val="left"/>
+      <w:pPr>
+        <w:tabs>
+          <w:tab w:val="num" w:pos="5040"/>
+        </w:tabs>
+        <w:ind w:left="5040" w:hanging="360"/>
+      </w:pPr>
+      <w:rPr>
+        <w:rFonts w:ascii="Wingdings" w:hAnsi="Wingdings" w:hint="default"/>
+        <w:sz w:val="20"/>
+      </w:rPr>
+    </w:lvl>
+    <w:lvl w:ilvl="7" w:tentative="1">
+      <w:start w:val="1"/>
+      <w:numFmt w:val="bullet"/>
+      <w:lvlText w:val=""/>
+      <w:lvlJc w:val="left"/>
+      <w:pPr>
+        <w:tabs>
+          <w:tab w:val="num" w:pos="5760"/>
+        </w:tabs>
+        <w:ind w:left="5760" w:hanging="360"/>
+      </w:pPr>
+      <w:rPr>
+        <w:rFonts w:ascii="Wingdings" w:hAnsi="Wingdings" w:hint="default"/>
+        <w:sz w:val="20"/>
+      </w:rPr>
+    </w:lvl>
+    <w:lvl w:ilvl="8" w:tentative="1">
+      <w:start w:val="1"/>
+      <w:numFmt w:val="bullet"/>
+      <w:lvlText w:val=""/>
+      <w:lvlJc w:val="left"/>
+      <w:pPr>
+        <w:tabs>
+          <w:tab w:val="num" w:pos="6480"/>
+        </w:tabs>
+        <w:ind w:left="6480" w:hanging="360"/>
+      </w:pPr>
+      <w:rPr>
+        <w:rFonts w:ascii="Wingdings" w:hAnsi="Wingdings" w:hint="default"/>
+        <w:sz w:val="20"/>
+      </w:rPr>
+    </w:lvl>
+  </w:abstractNum>
+  <w:num w:numId="1" w16cid:durableId="1756900802">
+    <w:abstractNumId w:val="2"/>
+  </w:num>
+  <w:num w:numId="2" w16cid:durableId="775294033">
+    <w:abstractNumId w:val="0"/>
+  </w:num>
+  <w:num w:numId="3" w16cid:durableId="2075275937">
+    <w:abstractNumId w:val="1"/>
+  </w:num>
+  <w:num w:numId="4" w16cid:durableId="1261721502">
+    <w:abstractNumId w:val="3"/>
+  </w:num>
+</w:numbering>
 </file>
 
 <file path=word/styles.xml><?xml version="1.0" encoding="utf-8"?>
@@ -715,7 +2483,6 @@
     <w:next w:val="Normal"/>
     <w:link w:val="Titre3Car"/>
     <w:uiPriority w:val="9"/>
-    <w:semiHidden/>
     <w:unhideWhenUsed/>
     <w:qFormat/>
     <w:rsid w:val="00784C2F"/>
@@ -921,7 +2688,6 @@
     <w:basedOn w:val="Policepardfaut"/>
     <w:link w:val="Titre3"/>
     <w:uiPriority w:val="9"/>
-    <w:semiHidden/>
     <w:rsid w:val="00784C2F"/>
     <w:rPr>
       <w:rFonts w:eastAsiaTheme="majorEastAsia" w:cstheme="majorBidi"/>

</xml_diff>

<commit_message>
Réponses question 4 ajoutées danse le fichier Fiche de jeu de donnée
</commit_message>
<xml_diff>
--- a/Fiche jeu de donnée.docx
+++ b/Fiche jeu de donnée.docx
@@ -368,10 +368,7 @@
         <w:t>Colonne F : Adresse : Chaine de caractère. Ex :</w:t>
       </w:r>
       <w:r>
-        <w:t xml:space="preserve"> </w:t>
-      </w:r>
-      <w:r>
-        <w:t>53 Rue Joseph Mattei</w:t>
+        <w:t xml:space="preserve"> 53 Rue Joseph Mattei</w:t>
       </w:r>
     </w:p>
     <w:p>
@@ -404,10 +401,7 @@
         <w:t xml:space="preserve">Colonne AN : </w:t>
       </w:r>
       <w:r>
-        <w:t xml:space="preserve">Carburants en rupture </w:t>
-      </w:r>
-      <w:r>
-        <w:t>définitive</w:t>
+        <w:t>Carburants en rupture définitive</w:t>
       </w:r>
       <w:r>
         <w:t xml:space="preserve"> : Chaine de caractère. Ex : </w:t>
@@ -428,95 +422,7 @@
         <w:t xml:space="preserve">Colonne AP : services proposés : chaine de caractères. Ex : </w:t>
       </w:r>
       <w:r>
-        <w:t xml:space="preserve">Toilettes </w:t>
-      </w:r>
-      <w:proofErr w:type="spellStart"/>
-      <w:r>
-        <w:t>publiques,Laverie,Relais</w:t>
-      </w:r>
-      <w:proofErr w:type="spellEnd"/>
-      <w:r>
-        <w:t xml:space="preserve"> </w:t>
-      </w:r>
-      <w:proofErr w:type="spellStart"/>
-      <w:r>
-        <w:t>colis,Boutique</w:t>
-      </w:r>
-      <w:proofErr w:type="spellEnd"/>
-      <w:r>
-        <w:t xml:space="preserve"> non </w:t>
-      </w:r>
-      <w:proofErr w:type="spellStart"/>
-      <w:r>
-        <w:t>alimentaire,Restauration</w:t>
-      </w:r>
-      <w:proofErr w:type="spellEnd"/>
-      <w:r>
-        <w:t xml:space="preserve"> à </w:t>
-      </w:r>
-      <w:proofErr w:type="spellStart"/>
-      <w:r>
-        <w:t>emporter,Restauration</w:t>
-      </w:r>
-      <w:proofErr w:type="spellEnd"/>
-      <w:r>
-        <w:t xml:space="preserve"> sur </w:t>
-      </w:r>
-      <w:proofErr w:type="spellStart"/>
-      <w:r>
-        <w:t>place,Bar,Vente</w:t>
-      </w:r>
-      <w:proofErr w:type="spellEnd"/>
-      <w:r>
-        <w:t xml:space="preserve"> de pétrole </w:t>
-      </w:r>
-      <w:proofErr w:type="spellStart"/>
-      <w:r>
-        <w:t>lampant,Station</w:t>
-      </w:r>
-      <w:proofErr w:type="spellEnd"/>
-      <w:r>
-        <w:t xml:space="preserve"> de </w:t>
-      </w:r>
-      <w:proofErr w:type="spellStart"/>
-      <w:r>
-        <w:t>gonflage,Location</w:t>
-      </w:r>
-      <w:proofErr w:type="spellEnd"/>
-      <w:r>
-        <w:t xml:space="preserve"> de </w:t>
-      </w:r>
-      <w:proofErr w:type="spellStart"/>
-      <w:r>
-        <w:t>véhicule,Piste</w:t>
-      </w:r>
-      <w:proofErr w:type="spellEnd"/>
-      <w:r>
-        <w:t xml:space="preserve"> poids </w:t>
-      </w:r>
-      <w:proofErr w:type="spellStart"/>
-      <w:r>
-        <w:t>lourds,Espace</w:t>
-      </w:r>
-      <w:proofErr w:type="spellEnd"/>
-      <w:r>
-        <w:t xml:space="preserve"> </w:t>
-      </w:r>
-      <w:proofErr w:type="spellStart"/>
-      <w:r>
-        <w:t>bébé,Vente</w:t>
-      </w:r>
-      <w:proofErr w:type="spellEnd"/>
-      <w:r>
-        <w:t xml:space="preserve"> de gaz domestique (Butane, Propane),</w:t>
-      </w:r>
-      <w:proofErr w:type="spellStart"/>
-      <w:r>
-        <w:t>Wifi,Automate</w:t>
-      </w:r>
-      <w:proofErr w:type="spellEnd"/>
-      <w:r>
-        <w:t xml:space="preserve"> CB 24/24,DAB (Distributeur automatique de billets)</w:t>
+        <w:t>Toilettes publiques,Laverie,Relais colis,Boutique non alimentaire,Restauration à emporter,Restauration sur place,Bar,Vente de pétrole lampant,Station de gonflage,Location de véhicule,Piste poids lourds,Espace bébé,Vente de gaz domestique (Butane, Propane),Wifi,Automate CB 24/24,DAB (Distributeur automatique de billets)</w:t>
       </w:r>
     </w:p>
     <w:p>
@@ -958,11 +864,9 @@
             <w:r>
               <w:t>=ET($AO1="</w:t>
             </w:r>
-            <w:proofErr w:type="spellStart"/>
             <w:r>
               <w:t>Pas-de-calais</w:t>
             </w:r>
-            <w:proofErr w:type="spellEnd"/>
             <w:r>
               <w:t>"; $AP1=</w:t>
             </w:r>
@@ -1260,6 +1164,15 @@
     <w:p>
       <w:pPr>
         <w:pStyle w:val="Paragraphedeliste"/>
+        <w:rPr>
+          <w:b/>
+          <w:bCs/>
+        </w:rPr>
+      </w:pPr>
+    </w:p>
+    <w:p>
+      <w:pPr>
+        <w:pStyle w:val="Paragraphedeliste"/>
       </w:pPr>
       <w:r>
         <w:t>Proposez </w:t>
@@ -1278,14 +1191,131 @@
     <w:p>
       <w:pPr>
         <w:pStyle w:val="Paragraphedeliste"/>
+      </w:pPr>
+    </w:p>
+    <w:p>
+      <w:pPr>
+        <w:pStyle w:val="Paragraphedeliste"/>
+      </w:pPr>
+      <w:r>
+        <w:t>1</w:t>
+      </w:r>
+      <w:r>
+        <w:rPr>
+          <w:vertAlign w:val="superscript"/>
+        </w:rPr>
+        <w:t>er</w:t>
+      </w:r>
+      <w:r>
+        <w:t xml:space="preserve"> usage, Classement des villes ou le carburant est le moins cher </w:t>
+      </w:r>
+      <w:r>
+        <w:t>et y développer des logement HLM</w:t>
+      </w:r>
+      <w:r>
+        <w:t>.</w:t>
+      </w:r>
+    </w:p>
+    <w:p>
+      <w:pPr>
+        <w:pStyle w:val="Paragraphedeliste"/>
+      </w:pPr>
+      <w:r>
+        <w:t>2</w:t>
+      </w:r>
+      <w:r>
+        <w:rPr>
+          <w:vertAlign w:val="superscript"/>
+        </w:rPr>
+        <w:t>ème</w:t>
+      </w:r>
+      <w:r>
+        <w:t xml:space="preserve"> usage</w:t>
+      </w:r>
+      <w:r>
+        <w:t> : accroitre l’offre de stations-services dans les zones régulièrement en pénurie.</w:t>
+      </w:r>
+    </w:p>
+    <w:p>
+      <w:pPr>
+        <w:pStyle w:val="Paragraphedeliste"/>
+      </w:pPr>
+    </w:p>
+    <w:p>
+      <w:pPr>
+        <w:pStyle w:val="Paragraphedeliste"/>
         <w:numPr>
           <w:ilvl w:val="0"/>
           <w:numId w:val="2"/>
         </w:numPr>
       </w:pPr>
       <w:r>
-        <w:t>la question métier à laquelle il répond ;</w:t>
-      </w:r>
+        <w:t>La</w:t>
+      </w:r>
+      <w:r>
+        <w:t xml:space="preserve"> question métier à laquelle il répond ;</w:t>
+      </w:r>
+    </w:p>
+    <w:p>
+      <w:pPr>
+        <w:pStyle w:val="Paragraphedeliste"/>
+      </w:pPr>
+      <w:r>
+        <w:t>1</w:t>
+      </w:r>
+      <w:r>
+        <w:rPr>
+          <w:vertAlign w:val="superscript"/>
+        </w:rPr>
+        <w:t>er</w:t>
+      </w:r>
+      <w:r>
+        <w:t xml:space="preserve"> usage : </w:t>
+      </w:r>
+      <w:r>
+        <w:t>Comment cartographier les stations-services autour de zones en développement</w:t>
+      </w:r>
+    </w:p>
+    <w:p>
+      <w:pPr>
+        <w:pStyle w:val="Paragraphedeliste"/>
+      </w:pPr>
+    </w:p>
+    <w:p>
+      <w:pPr>
+        <w:pStyle w:val="Paragraphedeliste"/>
+      </w:pPr>
+      <w:r>
+        <w:t>2</w:t>
+      </w:r>
+      <w:r>
+        <w:rPr>
+          <w:vertAlign w:val="superscript"/>
+        </w:rPr>
+        <w:t>ème</w:t>
+      </w:r>
+      <w:r>
+        <w:t xml:space="preserve"> usage</w:t>
+      </w:r>
+      <w:r>
+        <w:t xml:space="preserve"> : </w:t>
+      </w:r>
+      <w:r>
+        <w:t>faire un classement des stations-services en rupture et celles qui ne le sont pas, si c’est temporaire ou définitif, depuis combien de temps</w:t>
+      </w:r>
+      <w:r>
+        <w:t xml:space="preserve"> ? </w:t>
+      </w:r>
+    </w:p>
+    <w:p>
+      <w:pPr>
+        <w:pStyle w:val="Paragraphedeliste"/>
+      </w:pPr>
+    </w:p>
+    <w:p>
+      <w:pPr>
+        <w:pStyle w:val="Paragraphedeliste"/>
+      </w:pPr>
     </w:p>
     <w:p>
       <w:pPr>
@@ -1296,8 +1326,195 @@
         </w:numPr>
       </w:pPr>
       <w:r>
-        <w:t>la ou les colonnes utilisées ;</w:t>
-      </w:r>
+        <w:t>La</w:t>
+      </w:r>
+      <w:r>
+        <w:t xml:space="preserve"> ou les colonnes utilisées ;</w:t>
+      </w:r>
+    </w:p>
+    <w:p>
+      <w:pPr>
+        <w:pStyle w:val="Paragraphedeliste"/>
+      </w:pPr>
+    </w:p>
+    <w:p>
+      <w:pPr>
+        <w:pStyle w:val="Paragraphedeliste"/>
+      </w:pPr>
+      <w:r>
+        <w:t>1</w:t>
+      </w:r>
+      <w:r>
+        <w:rPr>
+          <w:vertAlign w:val="superscript"/>
+        </w:rPr>
+        <w:t>er</w:t>
+      </w:r>
+      <w:r>
+        <w:t xml:space="preserve"> usage : Adresse, Ville, </w:t>
+      </w:r>
+      <w:r>
+        <w:t>Prix Gazole</w:t>
+      </w:r>
+      <w:r>
+        <w:t xml:space="preserve">, </w:t>
+      </w:r>
+      <w:r>
+        <w:t>Prix SP95</w:t>
+      </w:r>
+      <w:r>
+        <w:t xml:space="preserve">, </w:t>
+      </w:r>
+      <w:r>
+        <w:t>Prix E85</w:t>
+      </w:r>
+      <w:r>
+        <w:t xml:space="preserve">, </w:t>
+      </w:r>
+      <w:r>
+        <w:t>Prix GPLc</w:t>
+      </w:r>
+      <w:r>
+        <w:t xml:space="preserve">, </w:t>
+      </w:r>
+      <w:r>
+        <w:t>Prix E10</w:t>
+      </w:r>
+      <w:r>
+        <w:t xml:space="preserve">, </w:t>
+      </w:r>
+      <w:r>
+        <w:t>Prix SP98</w:t>
+      </w:r>
+    </w:p>
+    <w:p>
+      <w:pPr>
+        <w:pStyle w:val="Paragraphedeliste"/>
+      </w:pPr>
+    </w:p>
+    <w:p>
+      <w:pPr>
+        <w:pStyle w:val="Paragraphedeliste"/>
+      </w:pPr>
+      <w:r>
+        <w:t>2</w:t>
+      </w:r>
+      <w:r>
+        <w:rPr>
+          <w:vertAlign w:val="superscript"/>
+        </w:rPr>
+        <w:t>ème</w:t>
+      </w:r>
+      <w:r>
+        <w:t xml:space="preserve"> usage ; </w:t>
+      </w:r>
+      <w:r>
+        <w:t>Adresse, Ville</w:t>
+      </w:r>
+      <w:r>
+        <w:t xml:space="preserve">, </w:t>
+      </w:r>
+      <w:r>
+        <w:t xml:space="preserve">Carburants en rupture </w:t>
+      </w:r>
+      <w:r>
+        <w:t>définitive</w:t>
+      </w:r>
+      <w:r>
+        <w:t xml:space="preserve">, </w:t>
+      </w:r>
+      <w:r>
+        <w:t>Carburants en rupture temporaire</w:t>
+      </w:r>
+      <w:r>
+        <w:t xml:space="preserve">, </w:t>
+      </w:r>
+      <w:r>
+        <w:t>Carburants indisponibles</w:t>
+      </w:r>
+      <w:r>
+        <w:t xml:space="preserve">, </w:t>
+      </w:r>
+      <w:r>
+        <w:t>Carburants disponibles</w:t>
+      </w:r>
+      <w:r>
+        <w:t xml:space="preserve">, </w:t>
+      </w:r>
+      <w:r>
+        <w:t>Type rupture gazole</w:t>
+      </w:r>
+      <w:r>
+        <w:t xml:space="preserve">, </w:t>
+      </w:r>
+      <w:r>
+        <w:t>Début rupture gazole (si temporaire)</w:t>
+      </w:r>
+      <w:r>
+        <w:t xml:space="preserve">, </w:t>
+      </w:r>
+      <w:r>
+        <w:t>Type rupture GPLc</w:t>
+      </w:r>
+      <w:r>
+        <w:t xml:space="preserve">, </w:t>
+      </w:r>
+      <w:r>
+        <w:t>Début rupture GPLc (si temporaire)</w:t>
+      </w:r>
+      <w:r>
+        <w:t xml:space="preserve">, </w:t>
+      </w:r>
+      <w:r>
+        <w:t>Type rupture e85</w:t>
+      </w:r>
+      <w:r>
+        <w:t xml:space="preserve">, </w:t>
+      </w:r>
+      <w:r>
+        <w:t>Début rupture e85 (si temporaire)</w:t>
+      </w:r>
+      <w:r>
+        <w:t xml:space="preserve">, </w:t>
+      </w:r>
+      <w:r>
+        <w:t>Type rupture sp95</w:t>
+      </w:r>
+      <w:r>
+        <w:t xml:space="preserve">, </w:t>
+      </w:r>
+      <w:r>
+        <w:t>Début rupture sp95 (si temporaire)</w:t>
+      </w:r>
+      <w:r>
+        <w:t xml:space="preserve">, </w:t>
+      </w:r>
+      <w:r>
+        <w:t>Type rupture sp98</w:t>
+      </w:r>
+      <w:r>
+        <w:t xml:space="preserve">, </w:t>
+      </w:r>
+      <w:r>
+        <w:t>Début rupture sp98 (si temporaire)</w:t>
+      </w:r>
+      <w:r>
+        <w:t xml:space="preserve">, </w:t>
+      </w:r>
+      <w:r>
+        <w:t>Type rupture e10</w:t>
+      </w:r>
+      <w:r>
+        <w:t xml:space="preserve">, </w:t>
+      </w:r>
+      <w:r>
+        <w:t>Début rupture e10 (si temporaire)</w:t>
+      </w:r>
+    </w:p>
+    <w:p>
+      <w:pPr>
+        <w:pStyle w:val="Paragraphedeliste"/>
+      </w:pPr>
     </w:p>
     <w:p>
       <w:pPr>
@@ -1308,8 +1525,56 @@
         </w:numPr>
       </w:pPr>
       <w:r>
-        <w:t>le défaut qualité qui pourrait fausser la réponse.</w:t>
-      </w:r>
+        <w:t>Le</w:t>
+      </w:r>
+      <w:r>
+        <w:t xml:space="preserve"> défaut qualité qui pourrait fausser la réponse.</w:t>
+      </w:r>
+    </w:p>
+    <w:p>
+      <w:pPr>
+        <w:pStyle w:val="Paragraphedeliste"/>
+      </w:pPr>
+      <w:r>
+        <w:t>1</w:t>
+      </w:r>
+      <w:r>
+        <w:rPr>
+          <w:vertAlign w:val="superscript"/>
+        </w:rPr>
+        <w:t>er</w:t>
+      </w:r>
+      <w:r>
+        <w:t xml:space="preserve"> usage :</w:t>
+      </w:r>
+      <w:r>
+        <w:t xml:space="preserve"> Problème de localisation des stations-service, ce qui faussera totalement la réponse.</w:t>
+      </w:r>
+    </w:p>
+    <w:p>
+      <w:pPr>
+        <w:pStyle w:val="Paragraphedeliste"/>
+      </w:pPr>
+      <w:r>
+        <w:t>2</w:t>
+      </w:r>
+      <w:r>
+        <w:rPr>
+          <w:vertAlign w:val="superscript"/>
+        </w:rPr>
+        <w:t>ème</w:t>
+      </w:r>
+      <w:r>
+        <w:t xml:space="preserve"> usage :</w:t>
+      </w:r>
+      <w:r>
+        <w:t xml:space="preserve"> Problème de formatage des dates et heures de rupture.</w:t>
+      </w:r>
+    </w:p>
+    <w:p>
+      <w:pPr>
+        <w:pStyle w:val="Paragraphedeliste"/>
+      </w:pPr>
     </w:p>
     <w:p>
       <w:pPr>
@@ -1330,121 +1595,6 @@
       <w:r>
         <w:t>Trouvez une seconde source pour un même indicateur (ex. population communale INSEE vs portail régional). Comparez les valeurs sur 5 lignes et expliquez les écarts éventuels.</w:t>
       </w:r>
-    </w:p>
-    <w:p>
-      <w:pPr>
-        <w:rPr>
-          <w:b/>
-          <w:bCs/>
-        </w:rPr>
-      </w:pPr>
-      <w:r>
-        <w:rPr>
-          <w:b/>
-          <w:bCs/>
-        </w:rPr>
-        <w:t>6. Versionner (10 min)</w:t>
-      </w:r>
-    </w:p>
-    <w:p>
-      <w:r>
-        <w:t>Dans votre dépôt GitHub :</w:t>
-      </w:r>
-    </w:p>
-    <w:p>
-      <w:pPr>
-        <w:numPr>
-          <w:ilvl w:val="0"/>
-          <w:numId w:val="3"/>
-        </w:numPr>
-      </w:pPr>
-      <w:r>
-        <w:t>ajoutez la grille et vos notes dans un fichier audit_qualite.md ;</w:t>
-      </w:r>
-    </w:p>
-    <w:p>
-      <w:pPr>
-        <w:numPr>
-          <w:ilvl w:val="0"/>
-          <w:numId w:val="3"/>
-        </w:numPr>
-      </w:pPr>
-      <w:r>
-        <w:t>faites au moins un commit avec un message explicite (ex. Ajout grille qualité carburants 62).</w:t>
-      </w:r>
-    </w:p>
-    <w:p>
-      <w:pPr>
-        <w:rPr>
-          <w:b/>
-          <w:bCs/>
-        </w:rPr>
-      </w:pPr>
-      <w:r>
-        <w:rPr>
-          <w:b/>
-          <w:bCs/>
-        </w:rPr>
-        <w:t>Critères de réussite (C1.1 · niveau 1)</w:t>
-      </w:r>
-    </w:p>
-    <w:p>
-      <w:pPr>
-        <w:numPr>
-          <w:ilvl w:val="0"/>
-          <w:numId w:val="4"/>
-        </w:numPr>
-      </w:pPr>
-      <w:r>
-        <w:t>[ ] La fiche d'identité est complète : source, licence et date de mise à jour sont renseignées.</w:t>
-      </w:r>
-    </w:p>
-    <w:p>
-      <w:pPr>
-        <w:numPr>
-          <w:ilvl w:val="0"/>
-          <w:numId w:val="4"/>
-        </w:numPr>
-      </w:pPr>
-      <w:r>
-        <w:t>[ ] Les 6 dimensions de la grille sont renseignées, chacune avec un constat précis.</w:t>
-      </w:r>
-    </w:p>
-    <w:p>
-      <w:pPr>
-        <w:numPr>
-          <w:ilvl w:val="0"/>
-          <w:numId w:val="4"/>
-        </w:numPr>
-      </w:pPr>
-      <w:r>
-        <w:t>[ ] Au moins deux usages sont proposés et reliés à des colonnes réelles du jeu.</w:t>
-      </w:r>
-    </w:p>
-    <w:p>
-      <w:pPr>
-        <w:numPr>
-          <w:ilvl w:val="0"/>
-          <w:numId w:val="4"/>
-        </w:numPr>
-      </w:pPr>
-      <w:r>
-        <w:t xml:space="preserve">[ ] Le travail est </w:t>
-      </w:r>
-      <w:proofErr w:type="spellStart"/>
-      <w:r>
-        <w:t>commité</w:t>
-      </w:r>
-      <w:proofErr w:type="spellEnd"/>
-      <w:r>
-        <w:t xml:space="preserve"> sur GitHub.</w:t>
-      </w:r>
-    </w:p>
-    <w:p/>
-    <w:p>
-      <w:pPr>
-        <w:pStyle w:val="Paragraphedeliste"/>
-      </w:pPr>
     </w:p>
     <w:sectPr>
       <w:pgSz w:w="11906" w:h="16838"/>
@@ -2634,6 +2784,7 @@
   <w:style w:type="character" w:default="1" w:styleId="Policepardfaut">
     <w:name w:val="Default Paragraph Font"/>
     <w:uiPriority w:val="1"/>
+    <w:semiHidden/>
     <w:unhideWhenUsed/>
   </w:style>
   <w:style w:type="table" w:default="1" w:styleId="TableauNormal">

</xml_diff>

<commit_message>
Début de réponse à la question à la quesstion 5
</commit_message>
<xml_diff>
--- a/Fiche jeu de donnée.docx
+++ b/Fiche jeu de donnée.docx
@@ -422,7 +422,85 @@
         <w:t xml:space="preserve">Colonne AP : services proposés : chaine de caractères. Ex : </w:t>
       </w:r>
       <w:r>
-        <w:t>Toilettes publiques,Laverie,Relais colis,Boutique non alimentaire,Restauration à emporter,Restauration sur place,Bar,Vente de pétrole lampant,Station de gonflage,Location de véhicule,Piste poids lourds,Espace bébé,Vente de gaz domestique (Butane, Propane),Wifi,Automate CB 24/24,DAB (Distributeur automatique de billets)</w:t>
+        <w:t>Toilettes publiques,</w:t>
+      </w:r>
+      <w:r>
+        <w:t xml:space="preserve"> </w:t>
+      </w:r>
+      <w:r>
+        <w:t>Laverie,</w:t>
+      </w:r>
+      <w:r>
+        <w:t xml:space="preserve"> </w:t>
+      </w:r>
+      <w:r>
+        <w:t>Relais colis,</w:t>
+      </w:r>
+      <w:r>
+        <w:t xml:space="preserve"> </w:t>
+      </w:r>
+      <w:r>
+        <w:t>Boutique non alimentaire,</w:t>
+      </w:r>
+      <w:r>
+        <w:t xml:space="preserve"> </w:t>
+      </w:r>
+      <w:r>
+        <w:t>Restauration à emporter,</w:t>
+      </w:r>
+      <w:r>
+        <w:t xml:space="preserve"> </w:t>
+      </w:r>
+      <w:r>
+        <w:t>Restauration sur place,</w:t>
+      </w:r>
+      <w:r>
+        <w:t xml:space="preserve"> </w:t>
+      </w:r>
+      <w:r>
+        <w:t>Bar,</w:t>
+      </w:r>
+      <w:r>
+        <w:t xml:space="preserve"> </w:t>
+      </w:r>
+      <w:r>
+        <w:t>Vente de pétrole lampant,</w:t>
+      </w:r>
+      <w:r>
+        <w:t xml:space="preserve"> </w:t>
+      </w:r>
+      <w:r>
+        <w:t>Station de gonflage,</w:t>
+      </w:r>
+      <w:r>
+        <w:t xml:space="preserve"> </w:t>
+      </w:r>
+      <w:r>
+        <w:t>Location de véhicule,</w:t>
+      </w:r>
+      <w:r>
+        <w:t xml:space="preserve"> </w:t>
+      </w:r>
+      <w:r>
+        <w:t>Piste poids lourds,</w:t>
+      </w:r>
+      <w:r>
+        <w:t xml:space="preserve"> </w:t>
+      </w:r>
+      <w:r>
+        <w:t>Espace bébé,</w:t>
+      </w:r>
+      <w:r>
+        <w:t xml:space="preserve"> </w:t>
+      </w:r>
+      <w:r>
+        <w:t>Vente de gaz domestique (Butane, Propane),Wifi,</w:t>
+      </w:r>
+      <w:r>
+        <w:t xml:space="preserve"> </w:t>
+      </w:r>
+      <w:r>
+        <w:t>Automate CB 24/24,DAB (Distributeur automatique de billets)</w:t>
       </w:r>
     </w:p>
     <w:p>
@@ -865,7 +943,7 @@
               <w:t>=ET($AO1="</w:t>
             </w:r>
             <w:r>
-              <w:t>Pas-de-calais</w:t>
+              <w:t>Pas-de-Calais</w:t>
             </w:r>
             <w:r>
               <w:t>"; $AP1=</w:t>
@@ -1583,17 +1661,88 @@
           <w:bCs/>
         </w:rPr>
       </w:pPr>
-      <w:r>
+    </w:p>
+    <w:p>
+      <w:pPr>
         <w:rPr>
           <w:b/>
           <w:bCs/>
         </w:rPr>
+      </w:pPr>
+    </w:p>
+    <w:p>
+      <w:pPr>
+        <w:rPr>
+          <w:b/>
+          <w:bCs/>
+        </w:rPr>
+      </w:pPr>
+    </w:p>
+    <w:p>
+      <w:pPr>
+        <w:rPr>
+          <w:b/>
+          <w:bCs/>
+        </w:rPr>
+      </w:pPr>
+    </w:p>
+    <w:p>
+      <w:pPr>
+        <w:rPr>
+          <w:b/>
+          <w:bCs/>
+        </w:rPr>
+      </w:pPr>
+      <w:r>
+        <w:rPr>
+          <w:b/>
+          <w:bCs/>
+        </w:rPr>
+        <w:lastRenderedPageBreak/>
         <w:t>5. Parcours + uniquement : croiser deux sources (en autonomie)</w:t>
       </w:r>
     </w:p>
     <w:p>
       <w:r>
         <w:t>Trouvez une seconde source pour un même indicateur (ex. population communale INSEE vs portail régional). Comparez les valeurs sur 5 lignes et expliquez les écarts éventuels.</w:t>
+      </w:r>
+    </w:p>
+    <w:p/>
+    <w:p>
+      <w:hyperlink r:id="rId6" w:history="1">
+        <w:r>
+          <w:rPr>
+            <w:rStyle w:val="Lienhypertexte"/>
+          </w:rPr>
+          <w:t>https://www.data.gouv.fr/datasets/nombre-de-menage-possedant-au-moins-une-voiture</w:t>
+        </w:r>
+      </w:hyperlink>
+    </w:p>
+    <w:p>
+      <w:hyperlink r:id="rId7" w:history="1">
+        <w:r>
+          <w:rPr>
+            <w:rStyle w:val="Lienhypertexte"/>
+          </w:rPr>
+          <w:t>https://www.insee.fr/fr/statistiques/2012694#tableau-TCRD_001_tab1_departements</w:t>
+        </w:r>
+      </w:hyperlink>
+    </w:p>
+    <w:p/>
+    <w:p>
+      <w:r>
+        <w:t>Voici deux jeux de donnée, un INSEE et un Data.gouv. Les deux jeux on pour sujet le nombre de voiture par foyer, et cela par régions.</w:t>
+      </w:r>
+    </w:p>
+    <w:p>
+      <w:r>
+        <w:t xml:space="preserve">Les bases de données ne peuvent malheureusement pas se croiser, car l’un parle en « part de foyer » possédant un véhicule, et l’autre parle en « nombre de ménages possédant une voiture » </w:t>
+      </w:r>
+    </w:p>
+    <w:p/>
+    <w:p>
+      <w:r>
+        <w:t>J’’essaie de trouver le nombre de foyer par département pour pouvoir en faire un calcul.</w:t>
       </w:r>
     </w:p>
     <w:sectPr>

</xml_diff>